<commit_message>
fix: Map ADDRESS and NOTES correctly from Monday.com and updated template
</commit_message>
<xml_diff>
--- a/GSA_TAGS.docx
+++ b/GSA_TAGS.docx
@@ -2738,7 +2738,7 @@
         <w:t>Total Monthly Connect Support Cost:</w:t>
       </w:r>
       <w:r>
-        <w:t xml:space="preserve"> $</w:t>
+        <w:t xml:space="preserve"> </w:t>
       </w:r>
       <w:r>
         <w:t>{{</w:t>
@@ -2758,7 +2758,7 @@
         <w:t>Per-Room Studio Monthly Rate:</w:t>
       </w:r>
       <w:r>
-        <w:t xml:space="preserve"> $</w:t>
+        <w:t xml:space="preserve"> </w:t>
       </w:r>
       <w:r>
         <w:t>{{STUDIO_SUPPORT}}</w:t>
@@ -2772,7 +2772,7 @@
         <w:t>Total Monthly Studio Support Cost:</w:t>
       </w:r>
       <w:r>
-        <w:t xml:space="preserve"> $</w:t>
+        <w:t xml:space="preserve"> </w:t>
       </w:r>
       <w:r>
         <w:t>{{TOTAL_STUDIO}}</w:t>
@@ -2798,7 +2798,7 @@
         <w:t>:</w:t>
       </w:r>
       <w:r>
-        <w:t xml:space="preserve"> $</w:t>
+        <w:t xml:space="preserve"> </w:t>
       </w:r>
       <w:r>
         <w:t>{{MEET</w:t>
@@ -2815,13 +2815,17 @@
         <w:t>Total Monthly Support Cost:</w:t>
       </w:r>
       <w:r>
-        <w:t xml:space="preserve"> $</w:t>
+        <w:t xml:space="preserve"> </w:t>
       </w:r>
       <w:r>
         <w:t>{{TOTAL_MONTHLY}}</w:t>
       </w:r>
     </w:p>
-    <w:p/>
+    <w:p>
+      <w:r>
+        <w:t>{{NOTES}}</w:t>
+      </w:r>
+    </w:p>
     <w:p/>
     <w:p>
       <w:pPr>

</xml_diff>

<commit_message>
feat: Add countersigner logic to BoldSign and update GSA UI term phrasing
</commit_message>
<xml_diff>
--- a/GSA_TAGS.docx
+++ b/GSA_TAGS.docx
@@ -710,11 +710,63 @@
         </w:tabs>
       </w:pPr>
       <w:r>
-        <w:t>By:</w:t>
+        <w:t>By</w:t>
+      </w:r>
+      <w:proofErr w:type="gramStart"/>
+      <w:r>
+        <w:t>:</w:t>
+      </w:r>
+      <w:r>
+        <w:t xml:space="preserve">  </w:t>
+      </w:r>
+      <w:r>
+        <w:rPr>
+          <w:color w:val="FFFFFF" w:themeColor="background1"/>
+        </w:rPr>
+        <w:t>{</w:t>
+      </w:r>
+      <w:proofErr w:type="gramEnd"/>
+      <w:r>
+        <w:rPr>
+          <w:color w:val="FFFFFF" w:themeColor="background1"/>
+        </w:rPr>
+        <w:t>{sign|1|*| |CustSign1}}</w:t>
       </w:r>
       <w:r>
         <w:tab/>
-        <w:t>By:</w:t>
+        <w:t>By</w:t>
+      </w:r>
+      <w:proofErr w:type="gramStart"/>
+      <w:r>
+        <w:t>:</w:t>
+      </w:r>
+      <w:r>
+        <w:t xml:space="preserve">  </w:t>
+      </w:r>
+      <w:r>
+        <w:rPr>
+          <w:color w:val="FFFFFF" w:themeColor="background1"/>
+        </w:rPr>
+        <w:t>{</w:t>
+      </w:r>
+      <w:proofErr w:type="gramEnd"/>
+      <w:r>
+        <w:rPr>
+          <w:color w:val="FFFFFF" w:themeColor="background1"/>
+        </w:rPr>
+        <w:t>{sign|1|*| |</w:t>
+      </w:r>
+      <w:r>
+        <w:rPr>
+          <w:color w:val="FFFFFF" w:themeColor="background1"/>
+        </w:rPr>
+        <w:t>HTSign1</w:t>
+      </w:r>
+      <w:r>
+        <w:rPr>
+          <w:color w:val="FFFFFF" w:themeColor="background1"/>
+        </w:rPr>
+        <w:t>}}</w:t>
       </w:r>
     </w:p>
     <w:p>
@@ -3096,11 +3148,63 @@
         </w:tabs>
       </w:pPr>
       <w:r>
-        <w:t>By:</w:t>
+        <w:t>By</w:t>
+      </w:r>
+      <w:proofErr w:type="gramStart"/>
+      <w:r>
+        <w:t>:</w:t>
+      </w:r>
+      <w:r>
+        <w:t xml:space="preserve">  </w:t>
+      </w:r>
+      <w:r>
+        <w:rPr>
+          <w:color w:val="FFFFFF" w:themeColor="background1"/>
+        </w:rPr>
+        <w:t>{</w:t>
+      </w:r>
+      <w:proofErr w:type="gramEnd"/>
+      <w:r>
+        <w:rPr>
+          <w:color w:val="FFFFFF" w:themeColor="background1"/>
+        </w:rPr>
+        <w:t>{sign|1|*| |CustSign2}}</w:t>
       </w:r>
       <w:r>
         <w:tab/>
-        <w:t>By:</w:t>
+        <w:t>By</w:t>
+      </w:r>
+      <w:proofErr w:type="gramStart"/>
+      <w:r>
+        <w:t>:</w:t>
+      </w:r>
+      <w:r>
+        <w:t xml:space="preserve">  </w:t>
+      </w:r>
+      <w:r>
+        <w:rPr>
+          <w:color w:val="FFFFFF" w:themeColor="background1"/>
+        </w:rPr>
+        <w:t>{</w:t>
+      </w:r>
+      <w:proofErr w:type="gramEnd"/>
+      <w:r>
+        <w:rPr>
+          <w:color w:val="FFFFFF" w:themeColor="background1"/>
+        </w:rPr>
+        <w:t>{sign|1|*| |</w:t>
+      </w:r>
+      <w:r>
+        <w:rPr>
+          <w:color w:val="FFFFFF" w:themeColor="background1"/>
+        </w:rPr>
+        <w:t>HT</w:t>
+      </w:r>
+      <w:r>
+        <w:rPr>
+          <w:color w:val="FFFFFF" w:themeColor="background1"/>
+        </w:rPr>
+        <w:t>Sign2}}</w:t>
       </w:r>
     </w:p>
     <w:p>

</xml_diff>

<commit_message>
fix: Update GSA template to include BoldSign text tags for printed names
</commit_message>
<xml_diff>
--- a/GSA_TAGS.docx
+++ b/GSA_TAGS.docx
@@ -1408,27 +1408,13 @@
         <w:rPr>
           <w:rFonts w:ascii="Arial" w:hAnsi="Arial" w:cs="Arial"/>
         </w:rPr>
-        <w:t>Name/Title</w:t>
-      </w:r>
-      <w:proofErr w:type="gramStart"/>
-      <w:r>
-        <w:rPr>
-          <w:rFonts w:ascii="Arial" w:hAnsi="Arial" w:cs="Arial"/>
-        </w:rPr>
-        <w:t>:</w:t>
-      </w:r>
-      <w:r>
-        <w:rPr>
-          <w:rFonts w:ascii="Arial" w:hAnsi="Arial" w:cs="Arial"/>
-        </w:rPr>
-        <w:t xml:space="preserve">  {</w:t>
-      </w:r>
-      <w:proofErr w:type="gramEnd"/>
-      <w:r>
-        <w:rPr>
-          <w:rFonts w:ascii="Arial" w:hAnsi="Arial" w:cs="Arial"/>
-        </w:rPr>
-        <w:t>{SIGNER_NAME}}</w:t>
+        <w:t>Name/Title:</w:t>
+      </w:r>
+      <w:r>
+        <w:rPr>
+          <w:rFonts w:ascii="Arial" w:hAnsi="Arial" w:cs="Arial"/>
+        </w:rPr>
+        <w:t xml:space="preserve">  {{SIGNER_NAME}}</w:t>
       </w:r>
       <w:r>
         <w:rPr>
@@ -1442,6 +1428,19 @@
           <w:rFonts w:ascii="Arial" w:hAnsi="Arial" w:cs="Arial"/>
         </w:rPr>
         <w:t>:</w:t>
+      </w:r>
+      <w:r>
+        <w:rPr>
+          <w:rFonts w:ascii="Arial" w:hAnsi="Arial" w:cs="Arial"/>
+        </w:rPr>
+        <w:t xml:space="preserve">  </w:t>
+      </w:r>
+      <w:r>
+        <w:rPr>
+          <w:rFonts w:ascii="Arial" w:hAnsi="Arial" w:cs="Arial"/>
+          <w:color w:val="000000" w:themeColor="text1"/>
+        </w:rPr>
+        <w:t>Art Woodruff / CFO</w:t>
       </w:r>
     </w:p>
     <w:p>
@@ -5492,6 +5491,7 @@
         </w:tabs>
         <w:rPr>
           <w:rFonts w:ascii="Arial" w:hAnsi="Arial" w:cs="Arial"/>
+          <w:color w:val="000000" w:themeColor="text1"/>
         </w:rPr>
       </w:pPr>
       <w:r>
@@ -5526,6 +5526,19 @@
         </w:rPr>
         <w:tab/>
         <w:t>Name/Title:</w:t>
+      </w:r>
+      <w:r>
+        <w:rPr>
+          <w:rFonts w:ascii="Arial" w:hAnsi="Arial" w:cs="Arial"/>
+        </w:rPr>
+        <w:t xml:space="preserve">  </w:t>
+      </w:r>
+      <w:r>
+        <w:rPr>
+          <w:rFonts w:ascii="Arial" w:hAnsi="Arial" w:cs="Arial"/>
+          <w:color w:val="000000" w:themeColor="text1"/>
+        </w:rPr>
+        <w:t>Art Woodruff / CFO</w:t>
       </w:r>
     </w:p>
     <w:p>
@@ -19614,12 +19627,7 @@
 </file>
 
 <file path=customXml/item1.xml><?xml version="1.0" encoding="utf-8"?>
-<?mso-contentType ?>
-<FormTemplates xmlns="http://schemas.microsoft.com/sharepoint/v3/contenttype/forms">
-  <Display>DocumentLibraryForm</Display>
-  <Edit>DocumentLibraryForm</Edit>
-  <New>DocumentLibraryForm</New>
-</FormTemplates>
+<b:Sources xmlns:b="http://schemas.openxmlformats.org/officeDocument/2006/bibliography" xmlns="http://schemas.openxmlformats.org/officeDocument/2006/bibliography" SelectedStyle="/APA.XSL" StyleName="APA"/>
 </file>
 
 <file path=customXml/item2.xml><?xml version="1.0" encoding="utf-8"?>
@@ -19634,7 +19642,12 @@
 </file>
 
 <file path=customXml/item3.xml><?xml version="1.0" encoding="utf-8"?>
-<b:Sources xmlns:b="http://schemas.openxmlformats.org/officeDocument/2006/bibliography" xmlns="http://schemas.openxmlformats.org/officeDocument/2006/bibliography" SelectedStyle="/APA.XSL" StyleName="APA"/>
+<?mso-contentType ?>
+<FormTemplates xmlns="http://schemas.microsoft.com/sharepoint/v3/contenttype/forms">
+  <Display>DocumentLibraryForm</Display>
+  <Edit>DocumentLibraryForm</Edit>
+  <New>DocumentLibraryForm</New>
+</FormTemplates>
 </file>
 
 <file path=customXml/item4.xml><?xml version="1.0" encoding="utf-8"?>
@@ -19839,9 +19852,9 @@
 </file>
 
 <file path=customXml/itemProps1.xml><?xml version="1.0" encoding="utf-8"?>
-<ds:datastoreItem xmlns:ds="http://schemas.openxmlformats.org/officeDocument/2006/customXml" ds:itemID="{C38BA60C-49B8-4CA4-ACD8-3991B91EA0F6}">
+<ds:datastoreItem xmlns:ds="http://schemas.openxmlformats.org/officeDocument/2006/customXml" ds:itemID="{EF278816-EC6F-A645-907D-7F25AECB1D4A}">
   <ds:schemaRefs>
-    <ds:schemaRef ds:uri="http://schemas.microsoft.com/sharepoint/v3/contenttype/forms"/>
+    <ds:schemaRef ds:uri="http://schemas.openxmlformats.org/officeDocument/2006/bibliography"/>
   </ds:schemaRefs>
 </ds:datastoreItem>
 </file>
@@ -19858,9 +19871,9 @@
 </file>
 
 <file path=customXml/itemProps3.xml><?xml version="1.0" encoding="utf-8"?>
-<ds:datastoreItem xmlns:ds="http://schemas.openxmlformats.org/officeDocument/2006/customXml" ds:itemID="{EF278816-EC6F-A645-907D-7F25AECB1D4A}">
+<ds:datastoreItem xmlns:ds="http://schemas.openxmlformats.org/officeDocument/2006/customXml" ds:itemID="{C38BA60C-49B8-4CA4-ACD8-3991B91EA0F6}">
   <ds:schemaRefs>
-    <ds:schemaRef ds:uri="http://schemas.openxmlformats.org/officeDocument/2006/bibliography"/>
+    <ds:schemaRef ds:uri="http://schemas.microsoft.com/sharepoint/v3/contenttype/forms"/>
   </ds:schemaRefs>
 </ds:datastoreItem>
 </file>

</xml_diff>